<commit_message>
Nuove stanze e fix inventario
</commit_message>
<xml_diff>
--- a/Il sito Jackanal.docx
+++ b/Il sito Jackanal.docx
@@ -80,17 +80,89 @@
     </w:p>
     <w:p>
       <w:r>
-        <w:t>Primo oggetto da raccogliere potrebbero essere i cavi vicino all’amplificatore di Riccardo, accanto alla batteria.</w:t>
-      </w:r>
-    </w:p>
-    <w:p>
-      <w:r>
-        <w:t>Ogni altro gecanale dà un oggetto al personaggio giocante che potrà essere utilizzato in seguito.</w:t>
+        <w:t>Primo oggetto da raccogliere potrebbero essere i cavi vicino all’amplificatore</w:t>
+      </w:r>
+      <w:r>
+        <w:t xml:space="preserve"> </w:t>
+      </w:r>
+      <w:r>
+        <w:t>accanto alla batteria.</w:t>
+      </w:r>
+    </w:p>
+    <w:p>
+      <w:r>
+        <w:t xml:space="preserve">Ogni altro </w:t>
+      </w:r>
+      <w:r>
+        <w:t>personaggio giocabile diventato NPC</w:t>
+      </w:r>
+      <w:r>
+        <w:t xml:space="preserve"> dà un oggetto al personaggio giocante che potrà essere utilizzato in seguito</w:t>
+      </w:r>
+      <w:r>
+        <w:t xml:space="preserve"> (creare solo interazione, inventarsi un oggetto per adesso)</w:t>
+      </w:r>
+      <w:r>
+        <w:t>.</w:t>
       </w:r>
     </w:p>
     <w:p>
       <w:r>
         <w:t>C’è bisogno di un HUD attivabile con un pulsante tipo zaino.</w:t>
+      </w:r>
+    </w:p>
+    <w:p/>
+    <w:p>
+      <w:pPr>
+        <w:rPr>
+          <w:b/>
+          <w:bCs/>
+        </w:rPr>
+      </w:pPr>
+    </w:p>
+    <w:p>
+      <w:pPr>
+        <w:rPr>
+          <w:b/>
+          <w:bCs/>
+        </w:rPr>
+      </w:pPr>
+    </w:p>
+    <w:p>
+      <w:pPr>
+        <w:rPr>
+          <w:b/>
+          <w:bCs/>
+        </w:rPr>
+      </w:pPr>
+    </w:p>
+    <w:p>
+      <w:pPr>
+        <w:rPr>
+          <w:b/>
+          <w:bCs/>
+        </w:rPr>
+      </w:pPr>
+      <w:r>
+        <w:rPr>
+          <w:b/>
+          <w:bCs/>
+        </w:rPr>
+        <w:lastRenderedPageBreak/>
+        <w:t>Interazioni degli oggetti</w:t>
+      </w:r>
+    </w:p>
+    <w:p>
+      <w:pPr>
+        <w:rPr>
+          <w:b/>
+          <w:bCs/>
+        </w:rPr>
+      </w:pPr>
+    </w:p>
+    <w:p>
+      <w:r>
+        <w:t>Un oggetto, ad esempio dei cavi, deve poter interagire con un altro oggetto. La prima prova sarà far interagire i cavi con l’amplificatore e la chitarra.</w:t>
       </w:r>
     </w:p>
     <w:sectPr>

</xml_diff>